<commit_message>
Regisro de avances de  interfaz, diseño y un obstaculo en el avance del proyecto.
</commit_message>
<xml_diff>
--- a/Bitácora.docx
+++ b/Bitácora.docx
@@ -419,7 +419,6 @@
         <w:t xml:space="preserve"> y se centralizó dentro de un método estático denominado </w:t>
       </w:r>
       <w:proofErr w:type="spellStart"/>
-      <w:proofErr w:type="gramStart"/>
       <w:r>
         <w:rPr>
           <w:rFonts w:ascii="Roboto Mono" w:eastAsia="Roboto Mono" w:hAnsi="Roboto Mono" w:cs="Roboto Mono"/>
@@ -437,9 +436,16 @@
           <w:sz w:val="24"/>
           <w:szCs w:val="24"/>
         </w:rPr>
-        <w:t>(</w:t>
-      </w:r>
-      <w:proofErr w:type="gramEnd"/>
+        <w:t>()</w:t>
+      </w:r>
+      <w:r>
+        <w:rPr>
+          <w:sz w:val="24"/>
+          <w:szCs w:val="24"/>
+        </w:rPr>
+        <w:t xml:space="preserve">. Esto garantiza que el estilo visual sea consistente, sin importar qué ventana se inicie primero. Asimismo, se reubicó el método </w:t>
+      </w:r>
+      <w:proofErr w:type="spellStart"/>
       <w:r>
         <w:rPr>
           <w:rFonts w:ascii="Roboto Mono" w:eastAsia="Roboto Mono" w:hAnsi="Roboto Mono" w:cs="Roboto Mono"/>
@@ -447,16 +453,33 @@
           <w:sz w:val="24"/>
           <w:szCs w:val="24"/>
         </w:rPr>
-        <w:t>)</w:t>
-      </w:r>
-      <w:r>
-        <w:rPr>
-          <w:sz w:val="24"/>
-          <w:szCs w:val="24"/>
-        </w:rPr>
-        <w:t xml:space="preserve">. Esto garantiza que el estilo visual sea consistente, sin importar qué ventana se inicie primero. Asimismo, se reubicó el método </w:t>
-      </w:r>
-      <w:proofErr w:type="spellStart"/>
+        <w:t>main</w:t>
+      </w:r>
+      <w:proofErr w:type="spellEnd"/>
+      <w:r>
+        <w:rPr>
+          <w:sz w:val="24"/>
+          <w:szCs w:val="24"/>
+        </w:rPr>
+        <w:t xml:space="preserve"> en esta clase para establecerla como el punto de entrada centralizado del programa.</w:t>
+      </w:r>
+    </w:p>
+    <w:p>
+      <w:pPr>
+        <w:spacing w:before="240" w:after="240"/>
+        <w:jc w:val="both"/>
+        <w:rPr>
+          <w:sz w:val="24"/>
+          <w:szCs w:val="24"/>
+        </w:rPr>
+      </w:pPr>
+      <w:r>
+        <w:rPr>
+          <w:sz w:val="24"/>
+          <w:szCs w:val="24"/>
+        </w:rPr>
+        <w:t xml:space="preserve">Para el sistema de seguridad, se implementó la clase </w:t>
+      </w:r>
       <w:r>
         <w:rPr>
           <w:rFonts w:ascii="Roboto Mono" w:eastAsia="Roboto Mono" w:hAnsi="Roboto Mono" w:cs="Roboto Mono"/>
@@ -464,15 +487,32 @@
           <w:sz w:val="24"/>
           <w:szCs w:val="24"/>
         </w:rPr>
-        <w:t>main</w:t>
-      </w:r>
-      <w:proofErr w:type="spellEnd"/>
-      <w:r>
-        <w:rPr>
-          <w:sz w:val="24"/>
-          <w:szCs w:val="24"/>
-        </w:rPr>
-        <w:t xml:space="preserve"> en esta clase para establecerla como el punto de entrada centralizado del programa.</w:t>
+        <w:t>Codigo.java</w:t>
+      </w:r>
+      <w:r>
+        <w:rPr>
+          <w:sz w:val="24"/>
+          <w:szCs w:val="24"/>
+        </w:rPr>
+        <w:t xml:space="preserve">. En esta clase, se desarrolló la lógica necesaria para el envío de correos electrónicos utilizando la librería </w:t>
+      </w:r>
+      <w:proofErr w:type="spellStart"/>
+      <w:r>
+        <w:rPr>
+          <w:rFonts w:ascii="Roboto Mono" w:eastAsia="Roboto Mono" w:hAnsi="Roboto Mono" w:cs="Roboto Mono"/>
+          <w:color w:val="188038"/>
+          <w:sz w:val="24"/>
+          <w:szCs w:val="24"/>
+        </w:rPr>
+        <w:t>jakarta.mail</w:t>
+      </w:r>
+      <w:proofErr w:type="spellEnd"/>
+      <w:r>
+        <w:rPr>
+          <w:sz w:val="24"/>
+          <w:szCs w:val="24"/>
+        </w:rPr>
+        <w:t>, simulando la comunicación del sistema mediante el envío de un token de acceso al usuario.</w:t>
       </w:r>
     </w:p>
     <w:p>
@@ -489,7 +529,7 @@
           <w:sz w:val="24"/>
           <w:szCs w:val="24"/>
         </w:rPr>
-        <w:t xml:space="preserve">Para el sistema de seguridad, se implementó la clase </w:t>
+        <w:t xml:space="preserve">En cuanto a la interfaz de usuario, se implementó la clase </w:t>
       </w:r>
       <w:r>
         <w:rPr>
@@ -498,17 +538,32 @@
           <w:sz w:val="24"/>
           <w:szCs w:val="24"/>
         </w:rPr>
-        <w:t>Codigo.java</w:t>
-      </w:r>
-      <w:r>
-        <w:rPr>
-          <w:sz w:val="24"/>
-          <w:szCs w:val="24"/>
-        </w:rPr>
-        <w:t xml:space="preserve">. En esta clase, se desarrolló la lógica necesaria para el envío de correos electrónicos utilizando la librería </w:t>
-      </w:r>
-      <w:proofErr w:type="spellStart"/>
-      <w:proofErr w:type="gramStart"/>
+        <w:t>Verificacion.java</w:t>
+      </w:r>
+      <w:r>
+        <w:rPr>
+          <w:sz w:val="24"/>
+          <w:szCs w:val="24"/>
+        </w:rPr>
+        <w:t xml:space="preserve"> como una entidad independiente para gestionar la ventana de </w:t>
+      </w:r>
+      <w:proofErr w:type="spellStart"/>
+      <w:r>
+        <w:rPr>
+          <w:sz w:val="24"/>
+          <w:szCs w:val="24"/>
+        </w:rPr>
+        <w:t>login</w:t>
+      </w:r>
+      <w:proofErr w:type="spellEnd"/>
+      <w:r>
+        <w:rPr>
+          <w:sz w:val="24"/>
+          <w:szCs w:val="24"/>
+        </w:rPr>
+        <w:t xml:space="preserve">. Dicha ventana se diseñó para contener el campo de entrada para el correo y el panel del logotipo. Actualmente, se está trabajando en la conexión del botón "Verificar" para que invoque el método </w:t>
+      </w:r>
+      <w:proofErr w:type="spellStart"/>
       <w:r>
         <w:rPr>
           <w:rFonts w:ascii="Roboto Mono" w:eastAsia="Roboto Mono" w:hAnsi="Roboto Mono" w:cs="Roboto Mono"/>
@@ -516,16 +571,24 @@
           <w:sz w:val="24"/>
           <w:szCs w:val="24"/>
         </w:rPr>
-        <w:t>jakarta.mail</w:t>
-      </w:r>
-      <w:proofErr w:type="spellEnd"/>
-      <w:proofErr w:type="gramEnd"/>
-      <w:r>
-        <w:rPr>
-          <w:sz w:val="24"/>
-          <w:szCs w:val="24"/>
-        </w:rPr>
-        <w:t>, simulando la comunicación del sistema mediante el envío de un token de acceso al usuario.</w:t>
+        <w:t>Codigo.enviarCodigo</w:t>
+      </w:r>
+      <w:proofErr w:type="spellEnd"/>
+      <w:r>
+        <w:rPr>
+          <w:rFonts w:ascii="Roboto Mono" w:eastAsia="Roboto Mono" w:hAnsi="Roboto Mono" w:cs="Roboto Mono"/>
+          <w:color w:val="188038"/>
+          <w:sz w:val="24"/>
+          <w:szCs w:val="24"/>
+        </w:rPr>
+        <w:t>()</w:t>
+      </w:r>
+      <w:r>
+        <w:rPr>
+          <w:sz w:val="24"/>
+          <w:szCs w:val="24"/>
+        </w:rPr>
+        <w:t>.</w:t>
       </w:r>
     </w:p>
     <w:p>
@@ -542,7 +605,7 @@
           <w:sz w:val="24"/>
           <w:szCs w:val="24"/>
         </w:rPr>
-        <w:t xml:space="preserve">En cuanto a la interfaz de usuario, se implementó la clase </w:t>
+        <w:t xml:space="preserve">Finalmente, se llevó a cabo la evolución de la clase </w:t>
       </w:r>
       <w:r>
         <w:rPr>
@@ -551,51 +614,103 @@
           <w:sz w:val="24"/>
           <w:szCs w:val="24"/>
         </w:rPr>
-        <w:t>Verificacion.java</w:t>
-      </w:r>
-      <w:r>
-        <w:rPr>
-          <w:sz w:val="24"/>
-          <w:szCs w:val="24"/>
-        </w:rPr>
-        <w:t xml:space="preserve"> como una entidad independiente para gestionar la ventana de </w:t>
-      </w:r>
-      <w:proofErr w:type="spellStart"/>
-      <w:r>
-        <w:rPr>
-          <w:sz w:val="24"/>
-          <w:szCs w:val="24"/>
-        </w:rPr>
-        <w:t>login</w:t>
-      </w:r>
-      <w:proofErr w:type="spellEnd"/>
-      <w:r>
-        <w:rPr>
-          <w:sz w:val="24"/>
-          <w:szCs w:val="24"/>
-        </w:rPr>
-        <w:t xml:space="preserve">. Dicha ventana se diseñó para contener el campo de entrada para el correo y el panel del logotipo. Actualmente, se está trabajando en la conexión del botón "Verificar" para que invoque el método </w:t>
-      </w:r>
-      <w:proofErr w:type="spellStart"/>
-      <w:r>
-        <w:rPr>
-          <w:rFonts w:ascii="Roboto Mono" w:eastAsia="Roboto Mono" w:hAnsi="Roboto Mono" w:cs="Roboto Mono"/>
-          <w:color w:val="188038"/>
-          <w:sz w:val="24"/>
-          <w:szCs w:val="24"/>
-        </w:rPr>
-        <w:t>Codigo.enviarCodigo</w:t>
-      </w:r>
-      <w:proofErr w:type="spellEnd"/>
-      <w:r>
-        <w:rPr>
-          <w:rFonts w:ascii="Roboto Mono" w:eastAsia="Roboto Mono" w:hAnsi="Roboto Mono" w:cs="Roboto Mono"/>
-          <w:color w:val="188038"/>
-          <w:sz w:val="24"/>
-          <w:szCs w:val="24"/>
-        </w:rPr>
-        <w:t>()</w:t>
-      </w:r>
+        <w:t>Inicio.java</w:t>
+      </w:r>
+      <w:r>
+        <w:rPr>
+          <w:sz w:val="24"/>
+          <w:szCs w:val="24"/>
+        </w:rPr>
+        <w:t xml:space="preserve">. Esta clase dejó de funcionar como la ventana base y se transformó en el modelo/controlador de la vista principal del </w:t>
+      </w:r>
+      <w:proofErr w:type="spellStart"/>
+      <w:r>
+        <w:rPr>
+          <w:sz w:val="24"/>
+          <w:szCs w:val="24"/>
+        </w:rPr>
+        <w:t>Dashboard</w:t>
+      </w:r>
+      <w:proofErr w:type="spellEnd"/>
+      <w:r>
+        <w:rPr>
+          <w:sz w:val="24"/>
+          <w:szCs w:val="24"/>
+        </w:rPr>
+        <w:t>, la cual se muestra al usuario una vez superada la verificación. Si bien se mantuvo la estructura visual del menú lateral —conservando los botones de Casa, Humano, Caja, Super y Herramienta—, la clase fue desacoplada por completo de la lógica de arranque general.</w:t>
+      </w:r>
+    </w:p>
+    <w:p>
+      <w:pPr>
+        <w:rPr>
+          <w:sz w:val="24"/>
+          <w:szCs w:val="24"/>
+        </w:rPr>
+      </w:pPr>
+      <w:r>
+        <w:rPr>
+          <w:sz w:val="24"/>
+          <w:szCs w:val="24"/>
+        </w:rPr>
+        <w:t xml:space="preserve">Se completó la integración del tema visual </w:t>
+      </w:r>
+      <w:proofErr w:type="spellStart"/>
+      <w:r>
+        <w:rPr>
+          <w:sz w:val="24"/>
+          <w:szCs w:val="24"/>
+        </w:rPr>
+        <w:t>Carbon</w:t>
+      </w:r>
+      <w:proofErr w:type="spellEnd"/>
+      <w:r>
+        <w:rPr>
+          <w:sz w:val="24"/>
+          <w:szCs w:val="24"/>
+        </w:rPr>
+        <w:t xml:space="preserve"> (de </w:t>
+      </w:r>
+      <w:proofErr w:type="spellStart"/>
+      <w:r>
+        <w:rPr>
+          <w:sz w:val="24"/>
+          <w:szCs w:val="24"/>
+        </w:rPr>
+        <w:t>FlatLaf</w:t>
+      </w:r>
+      <w:proofErr w:type="spellEnd"/>
+      <w:r>
+        <w:rPr>
+          <w:sz w:val="24"/>
+          <w:szCs w:val="24"/>
+        </w:rPr>
+        <w:t xml:space="preserve"> IntelliJ </w:t>
+      </w:r>
+      <w:proofErr w:type="spellStart"/>
+      <w:r>
+        <w:rPr>
+          <w:sz w:val="24"/>
+          <w:szCs w:val="24"/>
+        </w:rPr>
+        <w:t>Themes</w:t>
+      </w:r>
+      <w:proofErr w:type="spellEnd"/>
+      <w:r>
+        <w:rPr>
+          <w:sz w:val="24"/>
+          <w:szCs w:val="24"/>
+        </w:rPr>
+        <w:t xml:space="preserve">) como estilo definitivo del sistema, sustituyendo el tema claro utilizado anteriormente. Se definió una paleta de acento en verde-menta, consistente con el logotipo del proyecto, aplicada a los botones, campos de texto y elementos interactivos del sistema, dejando que el resto de la interfaz conserve la paleta oscura predeterminada de </w:t>
+      </w:r>
+      <w:proofErr w:type="spellStart"/>
+      <w:r>
+        <w:rPr>
+          <w:sz w:val="24"/>
+          <w:szCs w:val="24"/>
+        </w:rPr>
+        <w:t>Carbon</w:t>
+      </w:r>
+      <w:proofErr w:type="spellEnd"/>
       <w:r>
         <w:rPr>
           <w:sz w:val="24"/>
@@ -606,35 +721,64 @@
     </w:p>
     <w:p>
       <w:pPr>
-        <w:spacing w:before="240" w:after="240"/>
-        <w:jc w:val="both"/>
-        <w:rPr>
-          <w:sz w:val="24"/>
-          <w:szCs w:val="24"/>
-        </w:rPr>
-      </w:pPr>
-      <w:r>
-        <w:rPr>
-          <w:sz w:val="24"/>
-          <w:szCs w:val="24"/>
-        </w:rPr>
-        <w:t xml:space="preserve">Finalmente, se llevó a cabo la evolución de la clase </w:t>
-      </w:r>
-      <w:r>
-        <w:rPr>
-          <w:rFonts w:ascii="Roboto Mono" w:eastAsia="Roboto Mono" w:hAnsi="Roboto Mono" w:cs="Roboto Mono"/>
-          <w:color w:val="188038"/>
-          <w:sz w:val="24"/>
-          <w:szCs w:val="24"/>
-        </w:rPr>
-        <w:t>Inicio.java</w:t>
-      </w:r>
-      <w:r>
-        <w:rPr>
-          <w:sz w:val="24"/>
-          <w:szCs w:val="24"/>
-        </w:rPr>
-        <w:t xml:space="preserve">. Esta clase dejó de funcionar como la ventana base y se transformó en el modelo/controlador de la vista principal del </w:t>
+        <w:rPr>
+          <w:sz w:val="24"/>
+          <w:szCs w:val="24"/>
+        </w:rPr>
+      </w:pPr>
+    </w:p>
+    <w:p>
+      <w:pPr>
+        <w:rPr>
+          <w:sz w:val="24"/>
+          <w:szCs w:val="24"/>
+        </w:rPr>
+      </w:pPr>
+      <w:r>
+        <w:rPr>
+          <w:sz w:val="24"/>
+          <w:szCs w:val="24"/>
+        </w:rPr>
+        <w:t>Se corrigieron dos errores visuales en el logotipo: la referencia incorrecta al formato del archivo (.</w:t>
+      </w:r>
+      <w:proofErr w:type="spellStart"/>
+      <w:r>
+        <w:rPr>
+          <w:sz w:val="24"/>
+          <w:szCs w:val="24"/>
+        </w:rPr>
+        <w:t>jpg</w:t>
+      </w:r>
+      <w:proofErr w:type="spellEnd"/>
+      <w:r>
+        <w:rPr>
+          <w:sz w:val="24"/>
+          <w:szCs w:val="24"/>
+        </w:rPr>
+        <w:t xml:space="preserve"> en lugar de .png) y la deformación de la imagen al escalarla, resuelta mediante el cálculo proporcional del ancho respecto al alto original, evitando así que el logotipo se viera estirado.</w:t>
+      </w:r>
+    </w:p>
+    <w:p>
+      <w:pPr>
+        <w:rPr>
+          <w:sz w:val="24"/>
+          <w:szCs w:val="24"/>
+        </w:rPr>
+      </w:pPr>
+    </w:p>
+    <w:p>
+      <w:pPr>
+        <w:rPr>
+          <w:sz w:val="24"/>
+          <w:szCs w:val="24"/>
+        </w:rPr>
+      </w:pPr>
+      <w:r>
+        <w:rPr>
+          <w:sz w:val="24"/>
+          <w:szCs w:val="24"/>
+        </w:rPr>
+        <w:t>Se identificó y corrigió un problema de contraste en las tarjetas del panel principal (</w:t>
       </w:r>
       <w:proofErr w:type="spellStart"/>
       <w:r>
@@ -650,22 +794,7 @@
           <w:sz w:val="24"/>
           <w:szCs w:val="24"/>
         </w:rPr>
-        <w:t>, la cual se muestra al usuario una vez superada la verificación. Si bien se mantuvo la estructura visual del menú lateral —conservando los botones de Casa, Humano, Caja, Super y Herramienta—, la clase fue desacoplada por completo de la lógica de arranque general.</w:t>
-      </w:r>
-    </w:p>
-    <w:p>
-      <w:pPr>
-        <w:rPr>
-          <w:sz w:val="24"/>
-          <w:szCs w:val="24"/>
-        </w:rPr>
-      </w:pPr>
-      <w:r>
-        <w:rPr>
-          <w:sz w:val="24"/>
-          <w:szCs w:val="24"/>
-        </w:rPr>
-        <w:t xml:space="preserve">Se completó la integración del tema visual </w:t>
+        <w:t xml:space="preserve">): al combinar el tema oscuro </w:t>
       </w:r>
       <w:proofErr w:type="spellStart"/>
       <w:r>
@@ -681,117 +810,56 @@
           <w:sz w:val="24"/>
           <w:szCs w:val="24"/>
         </w:rPr>
-        <w:t xml:space="preserve"> (de </w:t>
-      </w:r>
-      <w:proofErr w:type="spellStart"/>
-      <w:r>
-        <w:rPr>
-          <w:sz w:val="24"/>
-          <w:szCs w:val="24"/>
-        </w:rPr>
-        <w:t>FlatLaf</w:t>
-      </w:r>
-      <w:proofErr w:type="spellEnd"/>
-      <w:r>
-        <w:rPr>
-          <w:sz w:val="24"/>
-          <w:szCs w:val="24"/>
-        </w:rPr>
-        <w:t xml:space="preserve"> IntelliJ </w:t>
-      </w:r>
-      <w:proofErr w:type="spellStart"/>
-      <w:r>
-        <w:rPr>
-          <w:sz w:val="24"/>
-          <w:szCs w:val="24"/>
-        </w:rPr>
-        <w:t>Themes</w:t>
-      </w:r>
-      <w:proofErr w:type="spellEnd"/>
-      <w:r>
-        <w:rPr>
-          <w:sz w:val="24"/>
-          <w:szCs w:val="24"/>
-        </w:rPr>
-        <w:t xml:space="preserve">) como estilo definitivo del sistema, sustituyendo el tema claro utilizado anteriormente. Se definió una paleta de acento en verde-menta, consistente con el logotipo del proyecto, aplicada a los botones, campos de texto y elementos interactivos del sistema, dejando que el resto de la interfaz conserve la paleta oscura predeterminada de </w:t>
-      </w:r>
-      <w:proofErr w:type="spellStart"/>
-      <w:r>
-        <w:rPr>
-          <w:sz w:val="24"/>
-          <w:szCs w:val="24"/>
-        </w:rPr>
-        <w:t>Carbon</w:t>
-      </w:r>
-      <w:proofErr w:type="spellEnd"/>
-      <w:r>
-        <w:rPr>
-          <w:sz w:val="24"/>
-          <w:szCs w:val="24"/>
-        </w:rPr>
-        <w:t>.</w:t>
-      </w:r>
-    </w:p>
-    <w:p>
-      <w:pPr>
-        <w:rPr>
-          <w:sz w:val="24"/>
-          <w:szCs w:val="24"/>
-        </w:rPr>
-      </w:pPr>
-    </w:p>
-    <w:p>
-      <w:pPr>
-        <w:rPr>
-          <w:sz w:val="24"/>
-          <w:szCs w:val="24"/>
-        </w:rPr>
-      </w:pPr>
-      <w:r>
-        <w:rPr>
-          <w:sz w:val="24"/>
-          <w:szCs w:val="24"/>
-        </w:rPr>
-        <w:t>Se corrigieron dos errores visuales en el logotipo: la referencia incorrecta al formato del archivo (.</w:t>
-      </w:r>
-      <w:proofErr w:type="spellStart"/>
-      <w:r>
-        <w:rPr>
-          <w:sz w:val="24"/>
-          <w:szCs w:val="24"/>
-        </w:rPr>
-        <w:t>jpg</w:t>
-      </w:r>
-      <w:proofErr w:type="spellEnd"/>
-      <w:r>
-        <w:rPr>
-          <w:sz w:val="24"/>
-          <w:szCs w:val="24"/>
-        </w:rPr>
-        <w:t xml:space="preserve"> en lugar de .png) y la deformación de la imagen al escalarla, resuelta mediante el cálculo proporcional del ancho respecto al alto original, evitando así que el logotipo se viera estirado.</w:t>
-      </w:r>
-    </w:p>
-    <w:p>
-      <w:pPr>
-        <w:rPr>
-          <w:sz w:val="24"/>
-          <w:szCs w:val="24"/>
-        </w:rPr>
-      </w:pPr>
-    </w:p>
-    <w:p>
-      <w:pPr>
-        <w:rPr>
-          <w:sz w:val="24"/>
-          <w:szCs w:val="24"/>
-        </w:rPr>
-      </w:pPr>
-      <w:r>
-        <w:rPr>
-          <w:sz w:val="24"/>
-          <w:szCs w:val="24"/>
-        </w:rPr>
-        <w:t>Se identificó y corrigió un problema de contraste en las tarjetas del panel principal (</w:t>
+        <w:t xml:space="preserve"> con tarjetas de fondo blanco, el texto heredaba un color claro que lo volvía ilegible. Se solucionó asignando explícitamente un color de texto oscuro a las etiquetas contenidas dentro de dichas tarjetas.</w:t>
+      </w:r>
+    </w:p>
+    <w:p>
+      <w:pPr>
+        <w:rPr>
+          <w:sz w:val="24"/>
+          <w:szCs w:val="24"/>
+        </w:rPr>
+      </w:pPr>
+    </w:p>
+    <w:p>
+      <w:r>
+        <w:rPr>
+          <w:sz w:val="24"/>
+          <w:szCs w:val="24"/>
+        </w:rPr>
+        <w:t>Se definió la estrategia de navegación entre secciones del sistema: en lugar de abrir una ventana (JFrame) independiente por cada módulo (Mi Dieta, Inventario, Compras, Configuración), se decidió que cada sección sea implementada como un panel (</w:t>
+      </w:r>
+      <w:proofErr w:type="spellStart"/>
+      <w:r>
+        <w:rPr>
+          <w:sz w:val="24"/>
+          <w:szCs w:val="24"/>
+        </w:rPr>
+        <w:t>JPanel</w:t>
+      </w:r>
+      <w:proofErr w:type="spellEnd"/>
+      <w:r>
+        <w:rPr>
+          <w:sz w:val="24"/>
+          <w:szCs w:val="24"/>
+        </w:rPr>
+        <w:t xml:space="preserve">) integrado mediante </w:t>
+      </w:r>
+      <w:proofErr w:type="spellStart"/>
+      <w:r>
+        <w:rPr>
+          <w:sz w:val="24"/>
+          <w:szCs w:val="24"/>
+        </w:rPr>
+        <w:t>CardLayout</w:t>
+      </w:r>
+      <w:proofErr w:type="spellEnd"/>
+      <w:r>
+        <w:rPr>
+          <w:sz w:val="24"/>
+          <w:szCs w:val="24"/>
+        </w:rPr>
+        <w:t xml:space="preserve"> dentro de la ventana principal del </w:t>
       </w:r>
       <w:proofErr w:type="spellStart"/>
       <w:r>
@@ -807,87 +875,6 @@
           <w:sz w:val="24"/>
           <w:szCs w:val="24"/>
         </w:rPr>
-        <w:t xml:space="preserve">): al combinar el tema oscuro </w:t>
-      </w:r>
-      <w:proofErr w:type="spellStart"/>
-      <w:r>
-        <w:rPr>
-          <w:sz w:val="24"/>
-          <w:szCs w:val="24"/>
-        </w:rPr>
-        <w:t>Carbon</w:t>
-      </w:r>
-      <w:proofErr w:type="spellEnd"/>
-      <w:r>
-        <w:rPr>
-          <w:sz w:val="24"/>
-          <w:szCs w:val="24"/>
-        </w:rPr>
-        <w:t xml:space="preserve"> con tarjetas de fondo blanco, el texto heredaba un color claro que lo volvía ilegible. Se solucionó asignando explícitamente un color de texto oscuro a las etiquetas contenidas dentro de dichas tarjetas.</w:t>
-      </w:r>
-    </w:p>
-    <w:p>
-      <w:pPr>
-        <w:rPr>
-          <w:sz w:val="24"/>
-          <w:szCs w:val="24"/>
-        </w:rPr>
-      </w:pPr>
-    </w:p>
-    <w:p>
-      <w:r>
-        <w:rPr>
-          <w:sz w:val="24"/>
-          <w:szCs w:val="24"/>
-        </w:rPr>
-        <w:t>Se definió la estrategia de navegación entre secciones del sistema: en lugar de abrir una ventana (JFrame) independiente por cada módulo (Mi Dieta, Inventario, Compras, Configuración), se decidió que cada sección sea implementada como un panel (</w:t>
-      </w:r>
-      <w:proofErr w:type="spellStart"/>
-      <w:r>
-        <w:rPr>
-          <w:sz w:val="24"/>
-          <w:szCs w:val="24"/>
-        </w:rPr>
-        <w:t>JPanel</w:t>
-      </w:r>
-      <w:proofErr w:type="spellEnd"/>
-      <w:r>
-        <w:rPr>
-          <w:sz w:val="24"/>
-          <w:szCs w:val="24"/>
-        </w:rPr>
-        <w:t xml:space="preserve">) integrado mediante </w:t>
-      </w:r>
-      <w:proofErr w:type="spellStart"/>
-      <w:r>
-        <w:rPr>
-          <w:sz w:val="24"/>
-          <w:szCs w:val="24"/>
-        </w:rPr>
-        <w:t>CardLayout</w:t>
-      </w:r>
-      <w:proofErr w:type="spellEnd"/>
-      <w:r>
-        <w:rPr>
-          <w:sz w:val="24"/>
-          <w:szCs w:val="24"/>
-        </w:rPr>
-        <w:t xml:space="preserve"> dentro de la ventana principal del </w:t>
-      </w:r>
-      <w:proofErr w:type="spellStart"/>
-      <w:r>
-        <w:rPr>
-          <w:sz w:val="24"/>
-          <w:szCs w:val="24"/>
-        </w:rPr>
-        <w:t>Dashboard</w:t>
-      </w:r>
-      <w:proofErr w:type="spellEnd"/>
-      <w:r>
-        <w:rPr>
-          <w:sz w:val="24"/>
-          <w:szCs w:val="24"/>
-        </w:rPr>
         <w:t>, replicando el mismo patrón ya utilizado en la pantalla de inicio de sesión para alternar entre "</w:t>
       </w:r>
       <w:proofErr w:type="spellStart"/>
@@ -908,6 +895,246 @@
       </w:r>
       <w:r>
         <w:t>interfaz única y cohesiva.</w:t>
+      </w:r>
+    </w:p>
+    <w:p>
+      <w:r>
+        <w:drawing>
+          <wp:inline distT="0" distB="0" distL="0" distR="0" wp14:anchorId="11933226" wp14:editId="01EBF442">
+            <wp:extent cx="5733415" cy="3224808"/>
+            <wp:effectExtent l="0" t="0" r="635" b="0"/>
+            <wp:docPr id="6" name="Imagen 6"/>
+            <wp:cNvGraphicFramePr>
+              <a:graphicFrameLocks xmlns:a="http://schemas.openxmlformats.org/drawingml/2006/main" noChangeAspect="1"/>
+            </wp:cNvGraphicFramePr>
+            <a:graphic xmlns:a="http://schemas.openxmlformats.org/drawingml/2006/main">
+              <a:graphicData uri="http://schemas.openxmlformats.org/drawingml/2006/picture">
+                <pic:pic xmlns:pic="http://schemas.openxmlformats.org/drawingml/2006/picture">
+                  <pic:nvPicPr>
+                    <pic:cNvPr id="1" name=""/>
+                    <pic:cNvPicPr/>
+                  </pic:nvPicPr>
+                  <pic:blipFill>
+                    <a:blip r:embed="rId8"/>
+                    <a:stretch>
+                      <a:fillRect/>
+                    </a:stretch>
+                  </pic:blipFill>
+                  <pic:spPr>
+                    <a:xfrm>
+                      <a:off x="0" y="0"/>
+                      <a:ext cx="5733415" cy="3224808"/>
+                    </a:xfrm>
+                    <a:prstGeom prst="rect">
+                      <a:avLst/>
+                    </a:prstGeom>
+                  </pic:spPr>
+                </pic:pic>
+              </a:graphicData>
+            </a:graphic>
+          </wp:inline>
+        </w:drawing>
+      </w:r>
+      <w:r>
+        <w:drawing>
+          <wp:inline distT="0" distB="0" distL="0" distR="0" wp14:anchorId="3453BD69" wp14:editId="3540B875">
+            <wp:extent cx="5733415" cy="3224530"/>
+            <wp:effectExtent l="0" t="0" r="635" b="0"/>
+            <wp:docPr id="5" name="Imagen 5"/>
+            <wp:cNvGraphicFramePr>
+              <a:graphicFrameLocks xmlns:a="http://schemas.openxmlformats.org/drawingml/2006/main" noChangeAspect="1"/>
+            </wp:cNvGraphicFramePr>
+            <a:graphic xmlns:a="http://schemas.openxmlformats.org/drawingml/2006/main">
+              <a:graphicData uri="http://schemas.openxmlformats.org/drawingml/2006/picture">
+                <pic:pic xmlns:pic="http://schemas.openxmlformats.org/drawingml/2006/picture">
+                  <pic:nvPicPr>
+                    <pic:cNvPr id="1" name=""/>
+                    <pic:cNvPicPr/>
+                  </pic:nvPicPr>
+                  <pic:blipFill>
+                    <a:blip r:embed="rId9"/>
+                    <a:stretch>
+                      <a:fillRect/>
+                    </a:stretch>
+                  </pic:blipFill>
+                  <pic:spPr>
+                    <a:xfrm>
+                      <a:off x="0" y="0"/>
+                      <a:ext cx="5733415" cy="3224530"/>
+                    </a:xfrm>
+                    <a:prstGeom prst="rect">
+                      <a:avLst/>
+                    </a:prstGeom>
+                  </pic:spPr>
+                </pic:pic>
+              </a:graphicData>
+            </a:graphic>
+          </wp:inline>
+        </w:drawing>
+      </w:r>
+    </w:p>
+    <w:p>
+      <w:r>
+        <w:drawing>
+          <wp:inline distT="0" distB="0" distL="0" distR="0" wp14:anchorId="1EBD88ED" wp14:editId="0F625868">
+            <wp:extent cx="5733415" cy="3221355"/>
+            <wp:effectExtent l="0" t="0" r="635" b="0"/>
+            <wp:docPr id="8" name="Imagen 8"/>
+            <wp:cNvGraphicFramePr>
+              <a:graphicFrameLocks xmlns:a="http://schemas.openxmlformats.org/drawingml/2006/main" noChangeAspect="1"/>
+            </wp:cNvGraphicFramePr>
+            <a:graphic xmlns:a="http://schemas.openxmlformats.org/drawingml/2006/main">
+              <a:graphicData uri="http://schemas.openxmlformats.org/drawingml/2006/picture">
+                <pic:pic xmlns:pic="http://schemas.openxmlformats.org/drawingml/2006/picture">
+                  <pic:nvPicPr>
+                    <pic:cNvPr id="1" name=""/>
+                    <pic:cNvPicPr/>
+                  </pic:nvPicPr>
+                  <pic:blipFill>
+                    <a:blip r:embed="rId10"/>
+                    <a:stretch>
+                      <a:fillRect/>
+                    </a:stretch>
+                  </pic:blipFill>
+                  <pic:spPr>
+                    <a:xfrm>
+                      <a:off x="0" y="0"/>
+                      <a:ext cx="5733415" cy="3221355"/>
+                    </a:xfrm>
+                    <a:prstGeom prst="rect">
+                      <a:avLst/>
+                    </a:prstGeom>
+                  </pic:spPr>
+                </pic:pic>
+              </a:graphicData>
+            </a:graphic>
+          </wp:inline>
+        </w:drawing>
+      </w:r>
+    </w:p>
+    <w:p/>
+    <w:p>
+      <w:r>
+        <w:t xml:space="preserve">Se realizo una reestructura en el </w:t>
+      </w:r>
+      <w:proofErr w:type="spellStart"/>
+      <w:r>
+        <w:t>codigo</w:t>
+      </w:r>
+      <w:proofErr w:type="spellEnd"/>
+      <w:r>
+        <w:t xml:space="preserve">, </w:t>
+      </w:r>
+      <w:proofErr w:type="spellStart"/>
+      <w:r>
+        <w:t>resolucion</w:t>
+      </w:r>
+      <w:proofErr w:type="spellEnd"/>
+      <w:r>
+        <w:t xml:space="preserve"> de errores como el aumento de opacidad al </w:t>
+      </w:r>
+      <w:proofErr w:type="spellStart"/>
+      <w:r>
+        <w:t>clickear</w:t>
+      </w:r>
+      <w:proofErr w:type="spellEnd"/>
+      <w:r>
+        <w:t xml:space="preserve"> varias veces el </w:t>
+      </w:r>
+      <w:proofErr w:type="spellStart"/>
+      <w:r>
+        <w:t>boton</w:t>
+      </w:r>
+      <w:proofErr w:type="spellEnd"/>
+      <w:r>
+        <w:t xml:space="preserve">, se agrego la funcionalidad al panel de mi dieta y queda </w:t>
+      </w:r>
+      <w:proofErr w:type="spellStart"/>
+      <w:r>
+        <w:t>penbdiente</w:t>
+      </w:r>
+      <w:proofErr w:type="spellEnd"/>
+      <w:r>
+        <w:t xml:space="preserve"> el </w:t>
+      </w:r>
+      <w:r>
+        <w:rPr>
+          <w:u w:val="single"/>
+        </w:rPr>
+        <w:t>guardado</w:t>
+      </w:r>
+      <w:r>
+        <w:t xml:space="preserve"> en el archivo </w:t>
+      </w:r>
+      <w:proofErr w:type="spellStart"/>
+      <w:r>
+        <w:t>csv</w:t>
+      </w:r>
+      <w:proofErr w:type="spellEnd"/>
+      <w:r>
+        <w:t xml:space="preserve">, la interfaz </w:t>
+      </w:r>
+      <w:proofErr w:type="spellStart"/>
+      <w:r>
+        <w:t>volvio</w:t>
+      </w:r>
+      <w:proofErr w:type="spellEnd"/>
+      <w:r>
+        <w:t xml:space="preserve"> a sufrir una mejora y se </w:t>
+      </w:r>
+      <w:proofErr w:type="spellStart"/>
+      <w:r>
+        <w:t>diseño</w:t>
+      </w:r>
+      <w:proofErr w:type="spellEnd"/>
+      <w:r>
+        <w:t xml:space="preserve"> el logotipo </w:t>
+      </w:r>
+      <w:r>
+        <w:rPr>
+          <w:noProof/>
+        </w:rPr>
+        <w:drawing>
+          <wp:inline distT="0" distB="0" distL="0" distR="0" wp14:anchorId="75EFEA04" wp14:editId="7719DAD0">
+            <wp:extent cx="6249737" cy="4419600"/>
+            <wp:effectExtent l="0" t="0" r="0" b="0"/>
+            <wp:docPr id="9" name="Imagen 9"/>
+            <wp:cNvGraphicFramePr>
+              <a:graphicFrameLocks xmlns:a="http://schemas.openxmlformats.org/drawingml/2006/main" noChangeAspect="1"/>
+            </wp:cNvGraphicFramePr>
+            <a:graphic xmlns:a="http://schemas.openxmlformats.org/drawingml/2006/main">
+              <a:graphicData uri="http://schemas.openxmlformats.org/drawingml/2006/picture">
+                <pic:pic xmlns:pic="http://schemas.openxmlformats.org/drawingml/2006/picture">
+                  <pic:nvPicPr>
+                    <pic:cNvPr id="9" name="Imagen 9"/>
+                    <pic:cNvPicPr/>
+                  </pic:nvPicPr>
+                  <pic:blipFill>
+                    <a:blip r:embed="rId11" cstate="print">
+                      <a:extLst>
+                        <a:ext uri="{28A0092B-C50C-407E-A947-70E740481C1C}">
+                          <a14:useLocalDpi xmlns:a14="http://schemas.microsoft.com/office/drawing/2010/main" val="0"/>
+                        </a:ext>
+                      </a:extLst>
+                    </a:blip>
+                    <a:stretch>
+                      <a:fillRect/>
+                    </a:stretch>
+                  </pic:blipFill>
+                  <pic:spPr>
+                    <a:xfrm>
+                      <a:off x="0" y="0"/>
+                      <a:ext cx="6250557" cy="4420180"/>
+                    </a:xfrm>
+                    <a:prstGeom prst="rect">
+                      <a:avLst/>
+                    </a:prstGeom>
+                  </pic:spPr>
+                </pic:pic>
+              </a:graphicData>
+            </a:graphic>
+          </wp:inline>
+        </w:drawing>
       </w:r>
     </w:p>
     <w:sectPr>
@@ -1436,6 +1663,7 @@
   <w:style w:type="character" w:default="1" w:styleId="Fuentedeprrafopredeter">
     <w:name w:val="Default Paragraph Font"/>
     <w:uiPriority w:val="1"/>
+    <w:semiHidden/>
     <w:unhideWhenUsed/>
   </w:style>
   <w:style w:type="table" w:default="1" w:styleId="Tablanormal">

</xml_diff>